<commit_message>
A teacher's front matter stays out by its shape, wherever it sits before his first sub-topic (#4550)
Published from Bhatti-Foundation/maktab@afdf76f017e9 (docs/directions/): changed CHANGELOG.md; changed own-file.md; changed subjects/9231 skeleton.docx; changed subjects/9231.md; changed subjects/9609 skeleton.docx; changed subjects/9609.md; changed subjects/9618 skeleton.docx; changed subjects/9618.md; changed subjects/9700 skeleton.docx; changed subjects/9700.md; changed subjects/9701 skeleton.docx; changed subjects/9701.md; changed subjects/9702 skeleton.docx; changed subjects/9702.md; changed subjects/9706 skeleton.docx; changed subjects/9706.md; changed subjects/9708 skeleton.docx; changed subjects/9708.md; changed subjects/9709 skeleton.docx; changed subjects/9709.md; changed subjects/DL skeleton.docx; changed subjects/DL.md.
</commit_message>
<xml_diff>
--- a/subjects/9231 skeleton.docx
+++ b/subjects/9231 skeleton.docx
@@ -27,12 +27,6 @@
       </w:r>
     </w:p>
     <w:p>
-      <w:pPr/>
-      <w:r>
-        <w:t xml:space="preserve">Covers learning outcomes 1.1.1, 1.1.2</w:t>
-      </w:r>
-    </w:p>
-    <w:p>
       <w:pPr>
         <w:pStyle w:val="Heading1"/>
       </w:pPr>
@@ -41,12 +35,6 @@
       </w:r>
     </w:p>
     <w:p>
-      <w:pPr/>
-      <w:r>
-        <w:t xml:space="preserve">Covers learning outcomes 1.2.1, 1.2.2</w:t>
-      </w:r>
-    </w:p>
-    <w:p>
       <w:pPr>
         <w:pStyle w:val="Heading1"/>
       </w:pPr>
@@ -55,12 +43,6 @@
       </w:r>
     </w:p>
     <w:p>
-      <w:pPr/>
-      <w:r>
-        <w:t xml:space="preserve">Covers learning outcomes 1.3.1, 1.3.2, 1.3.3</w:t>
-      </w:r>
-    </w:p>
-    <w:p>
       <w:pPr>
         <w:pStyle w:val="Heading1"/>
       </w:pPr>
@@ -69,12 +51,6 @@
       </w:r>
     </w:p>
     <w:p>
-      <w:pPr/>
-      <w:r>
-        <w:t xml:space="preserve">Covers learning outcomes 1.4.1, 1.4.2, 1.4.3, 1.4.4, 1.4.5</w:t>
-      </w:r>
-    </w:p>
-    <w:p>
       <w:pPr>
         <w:pStyle w:val="Heading1"/>
       </w:pPr>
@@ -83,12 +59,6 @@
       </w:r>
     </w:p>
     <w:p>
-      <w:pPr/>
-      <w:r>
-        <w:t xml:space="preserve">Covers learning outcomes 1.5.1, 1.5.2, 1.5.3</w:t>
-      </w:r>
-    </w:p>
-    <w:p>
       <w:pPr>
         <w:pStyle w:val="Heading1"/>
       </w:pPr>
@@ -97,12 +67,6 @@
       </w:r>
     </w:p>
     <w:p>
-      <w:pPr/>
-      <w:r>
-        <w:t xml:space="preserve">Covers learning outcomes 1.6.1, 1.6.2, 1.6.3</w:t>
-      </w:r>
-    </w:p>
-    <w:p>
       <w:pPr>
         <w:pStyle w:val="Heading1"/>
       </w:pPr>
@@ -111,12 +75,6 @@
       </w:r>
     </w:p>
     <w:p>
-      <w:pPr/>
-      <w:r>
-        <w:t xml:space="preserve">Covers learning outcomes 1.7.1, 1.7.2</w:t>
-      </w:r>
-    </w:p>
-    <w:p>
       <w:pPr>
         <w:pStyle w:val="Heading1"/>
       </w:pPr>
@@ -149,12 +107,6 @@
       </w:r>
     </w:p>
     <w:p>
-      <w:pPr/>
-      <w:r>
-        <w:t xml:space="preserve">Covers learning outcomes 2.1.1, 2.1.2, 2.1.3, 2.1.4</w:t>
-      </w:r>
-    </w:p>
-    <w:p>
       <w:pPr>
         <w:pStyle w:val="Heading1"/>
       </w:pPr>
@@ -163,12 +115,6 @@
       </w:r>
     </w:p>
     <w:p>
-      <w:pPr/>
-      <w:r>
-        <w:t xml:space="preserve">Covers learning outcomes 2.2.1, 2.2.2, 2.2.3, 2.2.4, 2.2.5, 2.2.6</w:t>
-      </w:r>
-    </w:p>
-    <w:p>
       <w:pPr>
         <w:pStyle w:val="Heading1"/>
       </w:pPr>
@@ -177,12 +123,6 @@
       </w:r>
     </w:p>
     <w:p>
-      <w:pPr/>
-      <w:r>
-        <w:t xml:space="preserve">Covers learning outcomes 2.3.1, 2.3.2, 2.3.3</w:t>
-      </w:r>
-    </w:p>
-    <w:p>
       <w:pPr>
         <w:pStyle w:val="Heading1"/>
       </w:pPr>
@@ -191,12 +131,6 @@
       </w:r>
     </w:p>
     <w:p>
-      <w:pPr/>
-      <w:r>
-        <w:t xml:space="preserve">Covers learning outcomes 2.4.1, 2.4.2, 2.4.3, 2.4.4</w:t>
-      </w:r>
-    </w:p>
-    <w:p>
       <w:pPr>
         <w:pStyle w:val="Heading1"/>
       </w:pPr>
@@ -205,12 +139,6 @@
       </w:r>
     </w:p>
     <w:p>
-      <w:pPr/>
-      <w:r>
-        <w:t xml:space="preserve">Covers learning outcomes 2.5.1, 2.5.2, 2.5.3</w:t>
-      </w:r>
-    </w:p>
-    <w:p>
       <w:pPr>
         <w:pStyle w:val="Heading1"/>
       </w:pPr>
@@ -219,12 +147,6 @@
       </w:r>
     </w:p>
     <w:p>
-      <w:pPr/>
-      <w:r>
-        <w:t xml:space="preserve">Covers learning outcomes 2.6.1, 2.6.2, 2.6.3, 2.6.4, 2.6.5, 2.6.6</w:t>
-      </w:r>
-    </w:p>
-    <w:p>
       <w:pPr>
         <w:pStyle w:val="Heading1"/>
       </w:pPr>
@@ -257,12 +179,6 @@
       </w:r>
     </w:p>
     <w:p>
-      <w:pPr/>
-      <w:r>
-        <w:t xml:space="preserve">Covers learning outcomes 3.1.1, 3.1.2, 3.1.3</w:t>
-      </w:r>
-    </w:p>
-    <w:p>
       <w:pPr>
         <w:pStyle w:val="Heading1"/>
       </w:pPr>
@@ -271,12 +187,6 @@
       </w:r>
     </w:p>
     <w:p>
-      <w:pPr/>
-      <w:r>
-        <w:t xml:space="preserve">Covers learning outcomes 3.2.1, 3.2.2, 3.2.3, 3.2.4, 3.2.5, 3.2.6</w:t>
-      </w:r>
-    </w:p>
-    <w:p>
       <w:pPr>
         <w:pStyle w:val="Heading1"/>
       </w:pPr>
@@ -285,12 +195,6 @@
       </w:r>
     </w:p>
     <w:p>
-      <w:pPr/>
-      <w:r>
-        <w:t xml:space="preserve">Covers learning outcomes 3.3.1, 3.3.2, 3.3.3, 3.3.4</w:t>
-      </w:r>
-    </w:p>
-    <w:p>
       <w:pPr>
         <w:pStyle w:val="Heading1"/>
       </w:pPr>
@@ -299,12 +203,6 @@
       </w:r>
     </w:p>
     <w:p>
-      <w:pPr/>
-      <w:r>
-        <w:t xml:space="preserve">Covers learning outcomes 3.4.1, 3.4.2, 3.4.3</w:t>
-      </w:r>
-    </w:p>
-    <w:p>
       <w:pPr>
         <w:pStyle w:val="Heading1"/>
       </w:pPr>
@@ -313,12 +211,6 @@
       </w:r>
     </w:p>
     <w:p>
-      <w:pPr/>
-      <w:r>
-        <w:t xml:space="preserve">Covers learning outcomes 3.5.1</w:t>
-      </w:r>
-    </w:p>
-    <w:p>
       <w:pPr>
         <w:pStyle w:val="Heading1"/>
       </w:pPr>
@@ -327,12 +219,6 @@
       </w:r>
     </w:p>
     <w:p>
-      <w:pPr/>
-      <w:r>
-        <w:t xml:space="preserve">Covers learning outcomes 3.6.1, 3.6.2</w:t>
-      </w:r>
-    </w:p>
-    <w:p>
       <w:pPr>
         <w:pStyle w:val="Heading1"/>
       </w:pPr>
@@ -365,12 +251,6 @@
       </w:r>
     </w:p>
     <w:p>
-      <w:pPr/>
-      <w:r>
-        <w:t xml:space="preserve">Covers learning outcomes 4.1.1, 4.1.2, 4.1.3, 4.1.4</w:t>
-      </w:r>
-    </w:p>
-    <w:p>
       <w:pPr>
         <w:pStyle w:val="Heading1"/>
       </w:pPr>
@@ -379,12 +259,6 @@
       </w:r>
     </w:p>
     <w:p>
-      <w:pPr/>
-      <w:r>
-        <w:t xml:space="preserve">Covers learning outcomes 4.2.1, 4.2.2, 4.2.3, 4.2.4, 4.2.5</w:t>
-      </w:r>
-    </w:p>
-    <w:p>
       <w:pPr>
         <w:pStyle w:val="Heading1"/>
       </w:pPr>
@@ -393,12 +267,6 @@
       </w:r>
     </w:p>
     <w:p>
-      <w:pPr/>
-      <w:r>
-        <w:t xml:space="preserve">Covers learning outcomes 4.3.1, 4.3.2, 4.3.3</w:t>
-      </w:r>
-    </w:p>
-    <w:p>
       <w:pPr>
         <w:pStyle w:val="Heading1"/>
       </w:pPr>
@@ -407,23 +275,11 @@
       </w:r>
     </w:p>
     <w:p>
-      <w:pPr/>
-      <w:r>
-        <w:t xml:space="preserve">Covers learning outcomes 4.4.1, 4.4.2, 4.4.3, 4.4.4</w:t>
-      </w:r>
-    </w:p>
-    <w:p>
       <w:pPr>
         <w:pStyle w:val="Heading1"/>
       </w:pPr>
       <w:r>
         <w:t xml:space="preserve">4.5 Probability generating functions</w:t>
-      </w:r>
-    </w:p>
-    <w:p>
-      <w:pPr/>
-      <w:r>
-        <w:t xml:space="preserve">Covers learning outcomes 4.5.1, 4.5.2, 4.5.3</w:t>
       </w:r>
     </w:p>
     <w:p>

</xml_diff>